<commit_message>
Added methods to class diagram
</commit_message>
<xml_diff>
--- a/Class Diagram/class diagram draft.docx
+++ b/Class Diagram/class diagram draft.docx
@@ -64,8 +64,13 @@
           <w:numId w:val="1"/>
         </w:numPr>
       </w:pPr>
-      <w:r>
-        <w:t>employeeId: String</w:t>
+      <w:proofErr w:type="spellStart"/>
+      <w:r>
+        <w:t>employeeId</w:t>
+      </w:r>
+      <w:proofErr w:type="spellEnd"/>
+      <w:r>
+        <w:t>: String</w:t>
       </w:r>
     </w:p>
     <w:p>
@@ -113,14 +118,24 @@
         </w:numPr>
       </w:pPr>
       <w:r>
-        <w:t>Administrator, InventoryManager</w:t>
-      </w:r>
-      <w:r>
-        <w:t>, Sto</w:t>
+        <w:t xml:space="preserve">Administrator, </w:t>
+      </w:r>
+      <w:proofErr w:type="spellStart"/>
+      <w:r>
+        <w:t>InventoryManager</w:t>
+      </w:r>
+      <w:proofErr w:type="spellEnd"/>
+      <w:r>
+        <w:t xml:space="preserve">, </w:t>
+      </w:r>
+      <w:proofErr w:type="spellStart"/>
+      <w:r>
+        <w:t>Sto</w:t>
       </w:r>
       <w:r>
         <w:t>reManager</w:t>
       </w:r>
+      <w:proofErr w:type="spellEnd"/>
       <w:r>
         <w:t>, Salesperson</w:t>
       </w:r>
@@ -151,20 +166,30 @@
           <w:numId w:val="1"/>
         </w:numPr>
       </w:pPr>
-      <w:r>
-        <w:t>PearlMartSystem &lt;&lt;controller&gt;&gt;</w:t>
-      </w:r>
-    </w:p>
-    <w:p>
-      <w:pPr>
-        <w:pStyle w:val="ListParagraph"/>
-        <w:numPr>
-          <w:ilvl w:val="0"/>
-          <w:numId w:val="1"/>
-        </w:numPr>
-      </w:pPr>
-      <w:r>
-        <w:t>SupplierGateway &lt;&lt;gateway&gt;&gt;</w:t>
+      <w:proofErr w:type="spellStart"/>
+      <w:r>
+        <w:t>PearlMartSystem</w:t>
+      </w:r>
+      <w:proofErr w:type="spellEnd"/>
+      <w:r>
+        <w:t xml:space="preserve"> &lt;&lt;controller&gt;&gt;</w:t>
+      </w:r>
+    </w:p>
+    <w:p>
+      <w:pPr>
+        <w:pStyle w:val="ListParagraph"/>
+        <w:numPr>
+          <w:ilvl w:val="0"/>
+          <w:numId w:val="1"/>
+        </w:numPr>
+      </w:pPr>
+      <w:proofErr w:type="spellStart"/>
+      <w:r>
+        <w:t>SupplierGateway</w:t>
+      </w:r>
+      <w:proofErr w:type="spellEnd"/>
+      <w:r>
+        <w:t xml:space="preserve"> &lt;&lt;gateway&gt;&gt;</w:t>
       </w:r>
     </w:p>
     <w:p>
@@ -214,11 +239,16 @@
           <w:numId w:val="1"/>
         </w:numPr>
       </w:pPr>
+      <w:proofErr w:type="spellStart"/>
       <w:r>
         <w:t>i</w:t>
       </w:r>
       <w:r>
-        <w:t>temId: String</w:t>
+        <w:t>temId</w:t>
+      </w:r>
+      <w:proofErr w:type="spellEnd"/>
+      <w:r>
+        <w:t>: String</w:t>
       </w:r>
     </w:p>
     <w:p>
@@ -253,9 +283,11 @@
           <w:numId w:val="1"/>
         </w:numPr>
       </w:pPr>
+      <w:proofErr w:type="spellStart"/>
       <w:r>
         <w:t>sellingPrice</w:t>
       </w:r>
+      <w:proofErr w:type="spellEnd"/>
       <w:r>
         <w:t>: double</w:t>
       </w:r>
@@ -292,8 +324,13 @@
           <w:numId w:val="1"/>
         </w:numPr>
       </w:pPr>
-      <w:r>
-        <w:t>placeOfOrigin: String</w:t>
+      <w:proofErr w:type="spellStart"/>
+      <w:r>
+        <w:t>placeOfOrigin</w:t>
+      </w:r>
+      <w:proofErr w:type="spellEnd"/>
+      <w:r>
+        <w:t>: String</w:t>
       </w:r>
     </w:p>
     <w:p>
@@ -316,57 +353,79 @@
           <w:numId w:val="1"/>
         </w:numPr>
       </w:pPr>
-      <w:r>
-        <w:t>ExpirableItem (extends Item)</w:t>
-      </w:r>
-    </w:p>
-    <w:p>
-      <w:pPr>
-        <w:pStyle w:val="ListParagraph"/>
-        <w:numPr>
-          <w:ilvl w:val="1"/>
-          <w:numId w:val="1"/>
-        </w:numPr>
-      </w:pPr>
-      <w:r>
-        <w:t>expirationDate: Date</w:t>
-      </w:r>
-    </w:p>
-    <w:p>
-      <w:pPr>
-        <w:pStyle w:val="ListParagraph"/>
-        <w:numPr>
-          <w:ilvl w:val="0"/>
-          <w:numId w:val="1"/>
-        </w:numPr>
-      </w:pPr>
+      <w:proofErr w:type="spellStart"/>
+      <w:r>
+        <w:t>ExpirableItem</w:t>
+      </w:r>
+      <w:proofErr w:type="spellEnd"/>
+      <w:r>
+        <w:t xml:space="preserve"> (extends Item)</w:t>
+      </w:r>
+    </w:p>
+    <w:p>
+      <w:pPr>
+        <w:pStyle w:val="ListParagraph"/>
+        <w:numPr>
+          <w:ilvl w:val="1"/>
+          <w:numId w:val="1"/>
+        </w:numPr>
+      </w:pPr>
+      <w:proofErr w:type="spellStart"/>
+      <w:r>
+        <w:t>expirationDate</w:t>
+      </w:r>
+      <w:proofErr w:type="spellEnd"/>
+      <w:r>
+        <w:t>: Date</w:t>
+      </w:r>
+    </w:p>
+    <w:p>
+      <w:pPr>
+        <w:pStyle w:val="ListParagraph"/>
+        <w:numPr>
+          <w:ilvl w:val="0"/>
+          <w:numId w:val="1"/>
+        </w:numPr>
+      </w:pPr>
+      <w:proofErr w:type="spellStart"/>
       <w:r>
         <w:t>StockMovement</w:t>
       </w:r>
-    </w:p>
-    <w:p>
-      <w:pPr>
-        <w:pStyle w:val="ListParagraph"/>
-        <w:numPr>
-          <w:ilvl w:val="1"/>
-          <w:numId w:val="1"/>
-        </w:numPr>
-      </w:pPr>
-      <w:r>
-        <w:t>movementId: String</w:t>
-      </w:r>
-    </w:p>
-    <w:p>
-      <w:pPr>
-        <w:pStyle w:val="ListParagraph"/>
-        <w:numPr>
-          <w:ilvl w:val="1"/>
-          <w:numId w:val="1"/>
-        </w:numPr>
-      </w:pPr>
-      <w:r>
-        <w:t>type: MovementType</w:t>
-      </w:r>
+      <w:proofErr w:type="spellEnd"/>
+    </w:p>
+    <w:p>
+      <w:pPr>
+        <w:pStyle w:val="ListParagraph"/>
+        <w:numPr>
+          <w:ilvl w:val="1"/>
+          <w:numId w:val="1"/>
+        </w:numPr>
+      </w:pPr>
+      <w:proofErr w:type="spellStart"/>
+      <w:r>
+        <w:t>movementId</w:t>
+      </w:r>
+      <w:proofErr w:type="spellEnd"/>
+      <w:r>
+        <w:t>: String</w:t>
+      </w:r>
+    </w:p>
+    <w:p>
+      <w:pPr>
+        <w:pStyle w:val="ListParagraph"/>
+        <w:numPr>
+          <w:ilvl w:val="1"/>
+          <w:numId w:val="1"/>
+        </w:numPr>
+      </w:pPr>
+      <w:r>
+        <w:t xml:space="preserve">type: </w:t>
+      </w:r>
+      <w:proofErr w:type="spellStart"/>
+      <w:r>
+        <w:t>MovementType</w:t>
+      </w:r>
+      <w:proofErr w:type="spellEnd"/>
     </w:p>
     <w:p>
       <w:pPr>
@@ -400,8 +459,13 @@
           <w:numId w:val="1"/>
         </w:numPr>
       </w:pPr>
-      <w:r>
-        <w:t>MovementType (</w:t>
+      <w:proofErr w:type="spellStart"/>
+      <w:r>
+        <w:t>MovementType</w:t>
+      </w:r>
+      <w:proofErr w:type="spellEnd"/>
+      <w:r>
+        <w:t xml:space="preserve"> (</w:t>
       </w:r>
       <w:r>
         <w:t>E</w:t>
@@ -481,8 +545,13 @@
           <w:numId w:val="1"/>
         </w:numPr>
       </w:pPr>
-      <w:r>
-        <w:t>supplierId: String</w:t>
+      <w:proofErr w:type="spellStart"/>
+      <w:r>
+        <w:t>supplierId</w:t>
+      </w:r>
+      <w:proofErr w:type="spellEnd"/>
+      <w:r>
+        <w:t>: String</w:t>
       </w:r>
     </w:p>
     <w:p>
@@ -505,69 +574,96 @@
           <w:numId w:val="1"/>
         </w:numPr>
       </w:pPr>
+      <w:proofErr w:type="spellStart"/>
       <w:r>
         <w:lastRenderedPageBreak/>
-        <w:t>contactInfo: String</w:t>
-      </w:r>
-    </w:p>
-    <w:p>
-      <w:pPr>
-        <w:pStyle w:val="ListParagraph"/>
-        <w:numPr>
-          <w:ilvl w:val="0"/>
-          <w:numId w:val="1"/>
-        </w:numPr>
-      </w:pPr>
+        <w:t>contactInfo</w:t>
+      </w:r>
+      <w:proofErr w:type="spellEnd"/>
+      <w:r>
+        <w:t>: String</w:t>
+      </w:r>
+    </w:p>
+    <w:p>
+      <w:pPr>
+        <w:pStyle w:val="ListParagraph"/>
+        <w:numPr>
+          <w:ilvl w:val="0"/>
+          <w:numId w:val="1"/>
+        </w:numPr>
+      </w:pPr>
+      <w:proofErr w:type="spellStart"/>
       <w:r>
         <w:t>SupplierOrder</w:t>
       </w:r>
-    </w:p>
-    <w:p>
-      <w:pPr>
-        <w:pStyle w:val="ListParagraph"/>
-        <w:numPr>
-          <w:ilvl w:val="1"/>
-          <w:numId w:val="1"/>
-        </w:numPr>
-      </w:pPr>
-      <w:r>
-        <w:t>orderId: String</w:t>
-      </w:r>
-    </w:p>
-    <w:p>
-      <w:pPr>
-        <w:pStyle w:val="ListParagraph"/>
-        <w:numPr>
-          <w:ilvl w:val="1"/>
-          <w:numId w:val="1"/>
-        </w:numPr>
-      </w:pPr>
-      <w:r>
-        <w:t>orderDate: Date</w:t>
-      </w:r>
-    </w:p>
-    <w:p>
-      <w:pPr>
-        <w:pStyle w:val="ListParagraph"/>
-        <w:numPr>
-          <w:ilvl w:val="1"/>
-          <w:numId w:val="1"/>
-        </w:numPr>
-      </w:pPr>
-      <w:r>
-        <w:t>deliveryAddress: String</w:t>
-      </w:r>
-    </w:p>
-    <w:p>
-      <w:pPr>
-        <w:pStyle w:val="ListParagraph"/>
-        <w:numPr>
-          <w:ilvl w:val="1"/>
-          <w:numId w:val="1"/>
-        </w:numPr>
-      </w:pPr>
-      <w:r>
-        <w:t>contactInfo: String</w:t>
+      <w:proofErr w:type="spellEnd"/>
+    </w:p>
+    <w:p>
+      <w:pPr>
+        <w:pStyle w:val="ListParagraph"/>
+        <w:numPr>
+          <w:ilvl w:val="1"/>
+          <w:numId w:val="1"/>
+        </w:numPr>
+      </w:pPr>
+      <w:proofErr w:type="spellStart"/>
+      <w:r>
+        <w:t>orderId</w:t>
+      </w:r>
+      <w:proofErr w:type="spellEnd"/>
+      <w:r>
+        <w:t>: String</w:t>
+      </w:r>
+    </w:p>
+    <w:p>
+      <w:pPr>
+        <w:pStyle w:val="ListParagraph"/>
+        <w:numPr>
+          <w:ilvl w:val="1"/>
+          <w:numId w:val="1"/>
+        </w:numPr>
+      </w:pPr>
+      <w:proofErr w:type="spellStart"/>
+      <w:r>
+        <w:t>orderDate</w:t>
+      </w:r>
+      <w:proofErr w:type="spellEnd"/>
+      <w:r>
+        <w:t>: Date</w:t>
+      </w:r>
+    </w:p>
+    <w:p>
+      <w:pPr>
+        <w:pStyle w:val="ListParagraph"/>
+        <w:numPr>
+          <w:ilvl w:val="1"/>
+          <w:numId w:val="1"/>
+        </w:numPr>
+      </w:pPr>
+      <w:proofErr w:type="spellStart"/>
+      <w:r>
+        <w:t>deliveryAddress</w:t>
+      </w:r>
+      <w:proofErr w:type="spellEnd"/>
+      <w:r>
+        <w:t>: String</w:t>
+      </w:r>
+    </w:p>
+    <w:p>
+      <w:pPr>
+        <w:pStyle w:val="ListParagraph"/>
+        <w:numPr>
+          <w:ilvl w:val="1"/>
+          <w:numId w:val="1"/>
+        </w:numPr>
+      </w:pPr>
+      <w:proofErr w:type="spellStart"/>
+      <w:r>
+        <w:t>contactInfo</w:t>
+      </w:r>
+      <w:proofErr w:type="spellEnd"/>
+      <w:r>
+        <w:t>: String</w:t>
       </w:r>
     </w:p>
     <w:p>
@@ -593,21 +689,28 @@
           <w:numId w:val="1"/>
         </w:numPr>
       </w:pPr>
-      <w:r>
-        <w:t>receivedDate: Date</w:t>
-      </w:r>
-    </w:p>
-    <w:p>
-      <w:pPr>
-        <w:pStyle w:val="ListParagraph"/>
-        <w:numPr>
-          <w:ilvl w:val="0"/>
-          <w:numId w:val="1"/>
-        </w:numPr>
-      </w:pPr>
+      <w:proofErr w:type="spellStart"/>
+      <w:r>
+        <w:t>receivedDate</w:t>
+      </w:r>
+      <w:proofErr w:type="spellEnd"/>
+      <w:r>
+        <w:t>: Date</w:t>
+      </w:r>
+    </w:p>
+    <w:p>
+      <w:pPr>
+        <w:pStyle w:val="ListParagraph"/>
+        <w:numPr>
+          <w:ilvl w:val="0"/>
+          <w:numId w:val="1"/>
+        </w:numPr>
+      </w:pPr>
+      <w:proofErr w:type="spellStart"/>
       <w:r>
         <w:t>OrderLine</w:t>
       </w:r>
+      <w:proofErr w:type="spellEnd"/>
     </w:p>
     <w:p>
       <w:pPr>
@@ -632,8 +735,13 @@
           <w:numId w:val="1"/>
         </w:numPr>
       </w:pPr>
-      <w:r>
-        <w:t>receivedQuantity: int</w:t>
+      <w:proofErr w:type="spellStart"/>
+      <w:r>
+        <w:t>receivedQuantity</w:t>
+      </w:r>
+      <w:proofErr w:type="spellEnd"/>
+      <w:r>
+        <w:t>: int</w:t>
       </w:r>
     </w:p>
     <w:p>
@@ -656,20 +764,30 @@
           <w:numId w:val="1"/>
         </w:numPr>
       </w:pPr>
-      <w:r>
-        <w:t>invoiceNumber: String</w:t>
-      </w:r>
-    </w:p>
-    <w:p>
-      <w:pPr>
-        <w:pStyle w:val="ListParagraph"/>
-        <w:numPr>
-          <w:ilvl w:val="1"/>
-          <w:numId w:val="1"/>
-        </w:numPr>
-      </w:pPr>
-      <w:r>
-        <w:t>invoiceDate: Date</w:t>
+      <w:proofErr w:type="spellStart"/>
+      <w:r>
+        <w:t>invoiceNumber</w:t>
+      </w:r>
+      <w:proofErr w:type="spellEnd"/>
+      <w:r>
+        <w:t>: String</w:t>
+      </w:r>
+    </w:p>
+    <w:p>
+      <w:pPr>
+        <w:pStyle w:val="ListParagraph"/>
+        <w:numPr>
+          <w:ilvl w:val="1"/>
+          <w:numId w:val="1"/>
+        </w:numPr>
+      </w:pPr>
+      <w:proofErr w:type="spellStart"/>
+      <w:r>
+        <w:t>invoiceDate</w:t>
+      </w:r>
+      <w:proofErr w:type="spellEnd"/>
+      <w:r>
+        <w:t>: Date</w:t>
       </w:r>
     </w:p>
     <w:p>
@@ -684,8 +802,13 @@
           <w:bCs/>
         </w:rPr>
       </w:pPr>
-      <w:r>
-        <w:t>totalAmount: Double</w:t>
+      <w:proofErr w:type="spellStart"/>
+      <w:r>
+        <w:t>totalAmount</w:t>
+      </w:r>
+      <w:proofErr w:type="spellEnd"/>
+      <w:r>
+        <w:t>: Double</w:t>
       </w:r>
     </w:p>
     <w:p>
@@ -711,57 +834,76 @@
           <w:numId w:val="1"/>
         </w:numPr>
       </w:pPr>
+      <w:proofErr w:type="gramStart"/>
       <w:r>
         <w:t>Sale</w:t>
       </w:r>
-    </w:p>
-    <w:p>
-      <w:pPr>
-        <w:pStyle w:val="ListParagraph"/>
-        <w:numPr>
-          <w:ilvl w:val="1"/>
-          <w:numId w:val="1"/>
-        </w:numPr>
-      </w:pPr>
-      <w:r>
-        <w:t>saleId: String</w:t>
-      </w:r>
-    </w:p>
-    <w:p>
-      <w:pPr>
-        <w:pStyle w:val="ListParagraph"/>
-        <w:numPr>
-          <w:ilvl w:val="1"/>
-          <w:numId w:val="1"/>
-        </w:numPr>
-      </w:pPr>
-      <w:r>
-        <w:t>dateTime: Date</w:t>
-      </w:r>
-    </w:p>
-    <w:p>
-      <w:pPr>
-        <w:pStyle w:val="ListParagraph"/>
-        <w:numPr>
-          <w:ilvl w:val="1"/>
-          <w:numId w:val="1"/>
-        </w:numPr>
-      </w:pPr>
-      <w:r>
-        <w:t>finalAmount: double</w:t>
-      </w:r>
-    </w:p>
-    <w:p>
-      <w:pPr>
-        <w:pStyle w:val="ListParagraph"/>
-        <w:numPr>
-          <w:ilvl w:val="0"/>
-          <w:numId w:val="1"/>
-        </w:numPr>
-      </w:pPr>
+      <w:proofErr w:type="gramEnd"/>
+    </w:p>
+    <w:p>
+      <w:pPr>
+        <w:pStyle w:val="ListParagraph"/>
+        <w:numPr>
+          <w:ilvl w:val="1"/>
+          <w:numId w:val="1"/>
+        </w:numPr>
+      </w:pPr>
+      <w:proofErr w:type="spellStart"/>
+      <w:r>
+        <w:t>saleId</w:t>
+      </w:r>
+      <w:proofErr w:type="spellEnd"/>
+      <w:r>
+        <w:t>: String</w:t>
+      </w:r>
+    </w:p>
+    <w:p>
+      <w:pPr>
+        <w:pStyle w:val="ListParagraph"/>
+        <w:numPr>
+          <w:ilvl w:val="1"/>
+          <w:numId w:val="1"/>
+        </w:numPr>
+      </w:pPr>
+      <w:proofErr w:type="spellStart"/>
+      <w:r>
+        <w:t>dateTime</w:t>
+      </w:r>
+      <w:proofErr w:type="spellEnd"/>
+      <w:r>
+        <w:t>: Date</w:t>
+      </w:r>
+    </w:p>
+    <w:p>
+      <w:pPr>
+        <w:pStyle w:val="ListParagraph"/>
+        <w:numPr>
+          <w:ilvl w:val="1"/>
+          <w:numId w:val="1"/>
+        </w:numPr>
+      </w:pPr>
+      <w:proofErr w:type="spellStart"/>
+      <w:r>
+        <w:t>finalAmount</w:t>
+      </w:r>
+      <w:proofErr w:type="spellEnd"/>
+      <w:r>
+        <w:t>: double</w:t>
+      </w:r>
+    </w:p>
+    <w:p>
+      <w:pPr>
+        <w:pStyle w:val="ListParagraph"/>
+        <w:numPr>
+          <w:ilvl w:val="0"/>
+          <w:numId w:val="1"/>
+        </w:numPr>
+      </w:pPr>
+      <w:proofErr w:type="spellStart"/>
       <w:r>
         <w:t>SaleLineItem</w:t>
       </w:r>
+      <w:proofErr w:type="spellEnd"/>
     </w:p>
     <w:p>
       <w:pPr>
@@ -783,8 +925,13 @@
           <w:numId w:val="1"/>
         </w:numPr>
       </w:pPr>
-      <w:r>
-        <w:t>unitPrice: double</w:t>
+      <w:proofErr w:type="spellStart"/>
+      <w:r>
+        <w:t>unitPrice</w:t>
+      </w:r>
+      <w:proofErr w:type="spellEnd"/>
+      <w:r>
+        <w:t>: double</w:t>
       </w:r>
     </w:p>
     <w:p>
@@ -819,32 +966,44 @@
           <w:numId w:val="1"/>
         </w:numPr>
       </w:pPr>
+      <w:proofErr w:type="spellStart"/>
       <w:r>
         <w:t>CancelledReceipt</w:t>
       </w:r>
-    </w:p>
-    <w:p>
-      <w:pPr>
-        <w:pStyle w:val="ListParagraph"/>
-        <w:numPr>
-          <w:ilvl w:val="1"/>
-          <w:numId w:val="1"/>
-        </w:numPr>
-      </w:pPr>
-      <w:r>
-        <w:t>cancelId: String</w:t>
-      </w:r>
-    </w:p>
-    <w:p>
-      <w:pPr>
-        <w:pStyle w:val="ListParagraph"/>
-        <w:numPr>
-          <w:ilvl w:val="1"/>
-          <w:numId w:val="1"/>
-        </w:numPr>
-      </w:pPr>
-      <w:r>
-        <w:t>cancelDate: Date</w:t>
+      <w:proofErr w:type="spellEnd"/>
+    </w:p>
+    <w:p>
+      <w:pPr>
+        <w:pStyle w:val="ListParagraph"/>
+        <w:numPr>
+          <w:ilvl w:val="1"/>
+          <w:numId w:val="1"/>
+        </w:numPr>
+      </w:pPr>
+      <w:proofErr w:type="spellStart"/>
+      <w:r>
+        <w:t>cancelId</w:t>
+      </w:r>
+      <w:proofErr w:type="spellEnd"/>
+      <w:r>
+        <w:t>: String</w:t>
+      </w:r>
+    </w:p>
+    <w:p>
+      <w:pPr>
+        <w:pStyle w:val="ListParagraph"/>
+        <w:numPr>
+          <w:ilvl w:val="1"/>
+          <w:numId w:val="1"/>
+        </w:numPr>
+      </w:pPr>
+      <w:proofErr w:type="spellStart"/>
+      <w:r>
+        <w:t>cancelDate</w:t>
+      </w:r>
+      <w:proofErr w:type="spellEnd"/>
+      <w:r>
+        <w:t>: Date</w:t>
       </w:r>
     </w:p>
     <w:p>
@@ -867,9 +1026,11 @@
           <w:numId w:val="1"/>
         </w:numPr>
       </w:pPr>
+      <w:proofErr w:type="spellStart"/>
       <w:r>
         <w:t>replacementId</w:t>
       </w:r>
+      <w:proofErr w:type="spellEnd"/>
       <w:r>
         <w:t>: String</w:t>
       </w:r>
@@ -882,8 +1043,13 @@
           <w:numId w:val="1"/>
         </w:numPr>
       </w:pPr>
-      <w:r>
-        <w:t>replacementDate: Date</w:t>
+      <w:proofErr w:type="spellStart"/>
+      <w:r>
+        <w:t>replacementDate</w:t>
+      </w:r>
+      <w:proofErr w:type="spellEnd"/>
+      <w:r>
+        <w:t>: Date</w:t>
       </w:r>
     </w:p>
     <w:p>
@@ -910,56 +1076,85 @@
           <w:numId w:val="1"/>
         </w:numPr>
       </w:pPr>
+      <w:proofErr w:type="spellStart"/>
+      <w:proofErr w:type="gramStart"/>
       <w:r>
         <w:t>CustomerRequest</w:t>
       </w:r>
-    </w:p>
-    <w:p>
-      <w:pPr>
-        <w:pStyle w:val="ListParagraph"/>
-        <w:numPr>
-          <w:ilvl w:val="1"/>
-          <w:numId w:val="1"/>
-        </w:numPr>
-      </w:pPr>
-      <w:r>
-        <w:t>requestId: Strng</w:t>
-      </w:r>
-    </w:p>
-    <w:p>
-      <w:pPr>
-        <w:pStyle w:val="ListParagraph"/>
-        <w:numPr>
-          <w:ilvl w:val="1"/>
-          <w:numId w:val="1"/>
-        </w:numPr>
-      </w:pPr>
-      <w:r>
-        <w:t>requestedItemName: String</w:t>
-      </w:r>
-    </w:p>
-    <w:p>
-      <w:pPr>
-        <w:pStyle w:val="ListParagraph"/>
-        <w:numPr>
-          <w:ilvl w:val="1"/>
-          <w:numId w:val="1"/>
-        </w:numPr>
-      </w:pPr>
-      <w:r>
-        <w:t>requestedQuanrity: int</w:t>
-      </w:r>
-    </w:p>
-    <w:p>
-      <w:pPr>
-        <w:pStyle w:val="ListParagraph"/>
-        <w:numPr>
-          <w:ilvl w:val="1"/>
-          <w:numId w:val="1"/>
-        </w:numPr>
-      </w:pPr>
-      <w:r>
-        <w:t>requestDate: Date</w:t>
+      <w:proofErr w:type="spellEnd"/>
+      <w:proofErr w:type="gramEnd"/>
+    </w:p>
+    <w:p>
+      <w:pPr>
+        <w:pStyle w:val="ListParagraph"/>
+        <w:numPr>
+          <w:ilvl w:val="1"/>
+          <w:numId w:val="1"/>
+        </w:numPr>
+      </w:pPr>
+      <w:proofErr w:type="spellStart"/>
+      <w:r>
+        <w:t>requestId</w:t>
+      </w:r>
+      <w:proofErr w:type="spellEnd"/>
+      <w:r>
+        <w:t xml:space="preserve">: </w:t>
+      </w:r>
+      <w:proofErr w:type="spellStart"/>
+      <w:r>
+        <w:t>Strng</w:t>
+      </w:r>
+      <w:proofErr w:type="spellEnd"/>
+    </w:p>
+    <w:p>
+      <w:pPr>
+        <w:pStyle w:val="ListParagraph"/>
+        <w:numPr>
+          <w:ilvl w:val="1"/>
+          <w:numId w:val="1"/>
+        </w:numPr>
+      </w:pPr>
+      <w:proofErr w:type="spellStart"/>
+      <w:r>
+        <w:t>requestedItemName</w:t>
+      </w:r>
+      <w:proofErr w:type="spellEnd"/>
+      <w:r>
+        <w:t>: String</w:t>
+      </w:r>
+    </w:p>
+    <w:p>
+      <w:pPr>
+        <w:pStyle w:val="ListParagraph"/>
+        <w:numPr>
+          <w:ilvl w:val="1"/>
+          <w:numId w:val="1"/>
+        </w:numPr>
+      </w:pPr>
+      <w:proofErr w:type="spellStart"/>
+      <w:r>
+        <w:t>requestedQuanrity</w:t>
+      </w:r>
+      <w:proofErr w:type="spellEnd"/>
+      <w:r>
+        <w:t>: int</w:t>
+      </w:r>
+    </w:p>
+    <w:p>
+      <w:pPr>
+        <w:pStyle w:val="ListParagraph"/>
+        <w:numPr>
+          <w:ilvl w:val="1"/>
+          <w:numId w:val="1"/>
+        </w:numPr>
+      </w:pPr>
+      <w:proofErr w:type="spellStart"/>
+      <w:r>
+        <w:t>requestDate</w:t>
+      </w:r>
+      <w:proofErr w:type="spellEnd"/>
+      <w:r>
+        <w:t>: Date</w:t>
       </w:r>
     </w:p>
     <w:p>
@@ -1010,10 +1205,23 @@
       </w:pPr>
       <w:r>
         <w:lastRenderedPageBreak/>
-        <w:t>Administrator, InventoryManager, StoreManager, Salesperson</w:t>
-      </w:r>
-      <w:r>
-        <w:t xml:space="preserve"> extends </w:t>
+        <w:t xml:space="preserve">Administrator, </w:t>
+      </w:r>
+      <w:proofErr w:type="spellStart"/>
+      <w:r>
+        <w:t>InventoryManager</w:t>
+      </w:r>
+      <w:proofErr w:type="spellEnd"/>
+      <w:r>
+        <w:t xml:space="preserve">, </w:t>
+      </w:r>
+      <w:proofErr w:type="spellStart"/>
+      <w:r>
+        <w:t>StoreManager</w:t>
+      </w:r>
+      <w:proofErr w:type="spellEnd"/>
+      <w:r>
+        <w:t xml:space="preserve">, Salesperson extends </w:t>
       </w:r>
       <w:r>
         <w:rPr>
@@ -1035,8 +1243,13 @@
           <w:bCs/>
         </w:rPr>
       </w:pPr>
-      <w:r>
-        <w:t>ExpirableItem extends</w:t>
+      <w:proofErr w:type="spellStart"/>
+      <w:r>
+        <w:t>ExpirableItem</w:t>
+      </w:r>
+      <w:proofErr w:type="spellEnd"/>
+      <w:r>
+        <w:t xml:space="preserve"> extends</w:t>
       </w:r>
       <w:r>
         <w:rPr>
@@ -1097,7 +1310,15 @@
         <w:t>tem (</w:t>
       </w:r>
       <w:r>
-        <w:t>1 -&gt; 0..*)</w:t>
+        <w:t xml:space="preserve">1 -&gt; </w:t>
+      </w:r>
+      <w:proofErr w:type="gramStart"/>
+      <w:r>
+        <w:t>0..</w:t>
+      </w:r>
+      <w:proofErr w:type="gramEnd"/>
+      <w:r>
+        <w:t>*)</w:t>
       </w:r>
     </w:p>
     <w:p>
@@ -1121,7 +1342,15 @@
         <w:t>◆</w:t>
       </w:r>
       <w:r>
-        <w:t xml:space="preserve">- StockMovement (1 -&gt; </w:t>
+        <w:t xml:space="preserve">- </w:t>
+      </w:r>
+      <w:proofErr w:type="spellStart"/>
+      <w:r>
+        <w:t>StockMovement</w:t>
+      </w:r>
+      <w:proofErr w:type="spellEnd"/>
+      <w:r>
+        <w:t xml:space="preserve"> (1 -&gt; </w:t>
       </w:r>
       <w:r>
         <w:t>0...*)</w:t>
@@ -1135,8 +1364,13 @@
           <w:numId w:val="1"/>
         </w:numPr>
       </w:pPr>
-      <w:r>
-        <w:t xml:space="preserve">SupplierOrder </w:t>
+      <w:proofErr w:type="spellStart"/>
+      <w:r>
+        <w:t>SupplierOrder</w:t>
+      </w:r>
+      <w:proofErr w:type="spellEnd"/>
+      <w:r>
+        <w:t xml:space="preserve"> </w:t>
       </w:r>
       <w:r>
         <w:rPr>
@@ -1145,10 +1379,23 @@
         <w:t>◆</w:t>
       </w:r>
       <w:r>
-        <w:t>-OrderLine</w:t>
-      </w:r>
-      <w:r>
-        <w:t xml:space="preserve"> (1 -&gt; 1..*)</w:t>
+        <w:t>-</w:t>
+      </w:r>
+      <w:proofErr w:type="spellStart"/>
+      <w:r>
+        <w:t>OrderLine</w:t>
+      </w:r>
+      <w:proofErr w:type="spellEnd"/>
+      <w:r>
+        <w:t xml:space="preserve"> (1 -&gt; </w:t>
+      </w:r>
+      <w:proofErr w:type="gramStart"/>
+      <w:r>
+        <w:t>1..</w:t>
+      </w:r>
+      <w:proofErr w:type="gramEnd"/>
+      <w:r>
+        <w:t>*)</w:t>
       </w:r>
     </w:p>
     <w:p>
@@ -1169,7 +1416,15 @@
         <w:t>◆</w:t>
       </w:r>
       <w:r>
-        <w:t>- SaleLineItem (1 -&gt; 1</w:t>
+        <w:t xml:space="preserve">- </w:t>
+      </w:r>
+      <w:proofErr w:type="spellStart"/>
+      <w:r>
+        <w:t>SaleLineItem</w:t>
+      </w:r>
+      <w:proofErr w:type="spellEnd"/>
+      <w:r>
+        <w:t xml:space="preserve"> (1 -&gt; 1</w:t>
       </w:r>
       <w:r>
         <w:t>…</w:t>
@@ -1211,8 +1466,13 @@
           <w:numId w:val="1"/>
         </w:numPr>
       </w:pPr>
-      <w:r>
-        <w:t xml:space="preserve">StockMovment </w:t>
+      <w:proofErr w:type="spellStart"/>
+      <w:r>
+        <w:t>StockMovment</w:t>
+      </w:r>
+      <w:proofErr w:type="spellEnd"/>
+      <w:r>
+        <w:t xml:space="preserve"> </w:t>
       </w:r>
       <w:r>
         <w:t>–</w:t>
@@ -1238,8 +1498,13 @@
           <w:numId w:val="1"/>
         </w:numPr>
       </w:pPr>
-      <w:r>
-        <w:t>OrderLine – Item (order</w:t>
+      <w:proofErr w:type="spellStart"/>
+      <w:r>
+        <w:t>OrderLine</w:t>
+      </w:r>
+      <w:proofErr w:type="spellEnd"/>
+      <w:r>
+        <w:t xml:space="preserve"> – Item (order</w:t>
       </w:r>
       <w:r>
         <w:t>s</w:t>
@@ -1259,101 +1524,205 @@
           <w:numId w:val="1"/>
         </w:numPr>
       </w:pPr>
-      <w:r>
-        <w:t>SaleLineItem – Item (sells) 0…* to 1</w:t>
-      </w:r>
-    </w:p>
-    <w:p>
-      <w:pPr>
-        <w:pStyle w:val="ListParagraph"/>
-        <w:numPr>
-          <w:ilvl w:val="0"/>
-          <w:numId w:val="1"/>
-        </w:numPr>
-      </w:pPr>
-      <w:r>
-        <w:t>SupplierOrder – Supplier (placed with) 0..* to 1</w:t>
-      </w:r>
-    </w:p>
-    <w:p>
-      <w:pPr>
-        <w:pStyle w:val="ListParagraph"/>
-        <w:numPr>
-          <w:ilvl w:val="0"/>
-          <w:numId w:val="1"/>
-        </w:numPr>
-      </w:pPr>
-      <w:r>
-        <w:t>SupplierOrder – Invoice (bills) 1 to 0..1</w:t>
-      </w:r>
-    </w:p>
-    <w:p>
-      <w:pPr>
-        <w:pStyle w:val="ListParagraph"/>
-        <w:numPr>
-          <w:ilvl w:val="0"/>
-          <w:numId w:val="1"/>
-        </w:numPr>
-      </w:pPr>
-      <w:r>
-        <w:t xml:space="preserve">SupplierOrder </w:t>
+      <w:proofErr w:type="spellStart"/>
+      <w:r>
+        <w:t>SaleLineItem</w:t>
+      </w:r>
+      <w:proofErr w:type="spellEnd"/>
+      <w:r>
+        <w:t xml:space="preserve"> – Item (sells) 0…* to 1</w:t>
+      </w:r>
+    </w:p>
+    <w:p>
+      <w:pPr>
+        <w:pStyle w:val="ListParagraph"/>
+        <w:numPr>
+          <w:ilvl w:val="0"/>
+          <w:numId w:val="1"/>
+        </w:numPr>
+      </w:pPr>
+      <w:proofErr w:type="spellStart"/>
+      <w:r>
+        <w:t>SupplierOrder</w:t>
+      </w:r>
+      <w:proofErr w:type="spellEnd"/>
+      <w:r>
+        <w:t xml:space="preserve"> – Supplier (placed with) </w:t>
+      </w:r>
+      <w:proofErr w:type="gramStart"/>
+      <w:r>
+        <w:t>0..</w:t>
+      </w:r>
+      <w:proofErr w:type="gramEnd"/>
+      <w:r>
+        <w:t>* to 1</w:t>
+      </w:r>
+    </w:p>
+    <w:p>
+      <w:pPr>
+        <w:pStyle w:val="ListParagraph"/>
+        <w:numPr>
+          <w:ilvl w:val="0"/>
+          <w:numId w:val="1"/>
+        </w:numPr>
+      </w:pPr>
+      <w:proofErr w:type="spellStart"/>
+      <w:r>
+        <w:t>SupplierOrder</w:t>
+      </w:r>
+      <w:proofErr w:type="spellEnd"/>
+      <w:r>
+        <w:t xml:space="preserve"> – Invoice (bills) 1 to </w:t>
+      </w:r>
+      <w:proofErr w:type="gramStart"/>
+      <w:r>
+        <w:t>0..</w:t>
+      </w:r>
+      <w:proofErr w:type="gramEnd"/>
+      <w:r>
+        <w:t>1</w:t>
+      </w:r>
+    </w:p>
+    <w:p>
+      <w:pPr>
+        <w:pStyle w:val="ListParagraph"/>
+        <w:numPr>
+          <w:ilvl w:val="0"/>
+          <w:numId w:val="1"/>
+        </w:numPr>
+      </w:pPr>
+      <w:proofErr w:type="spellStart"/>
+      <w:r>
+        <w:t>SupplierOrder</w:t>
+      </w:r>
+      <w:proofErr w:type="spellEnd"/>
+      <w:r>
+        <w:t xml:space="preserve"> </w:t>
       </w:r>
       <w:r>
         <w:t>–</w:t>
       </w:r>
       <w:r>
-        <w:t xml:space="preserve"> InventoryManager</w:t>
-      </w:r>
-      <w:r>
-        <w:t xml:space="preserve"> (prepares) 0..* to 1</w:t>
-      </w:r>
-    </w:p>
-    <w:p>
-      <w:pPr>
-        <w:pStyle w:val="ListParagraph"/>
-        <w:numPr>
-          <w:ilvl w:val="0"/>
-          <w:numId w:val="1"/>
-        </w:numPr>
-      </w:pPr>
-      <w:r>
-        <w:t xml:space="preserve">SupplierOrder – StoreManager (verifies) 0..* to </w:t>
-      </w:r>
-      <w:r>
-        <w:t>0..1</w:t>
-      </w:r>
-    </w:p>
-    <w:p>
-      <w:pPr>
-        <w:pStyle w:val="ListParagraph"/>
-        <w:numPr>
-          <w:ilvl w:val="0"/>
-          <w:numId w:val="1"/>
-        </w:numPr>
-      </w:pPr>
-      <w:r>
-        <w:t xml:space="preserve">Sale – Salesperson </w:t>
-      </w:r>
-      <w:r>
-        <w:t>(processes) 0..* to 1</w:t>
-      </w:r>
-    </w:p>
-    <w:p>
-      <w:pPr>
-        <w:pStyle w:val="ListParagraph"/>
-        <w:numPr>
-          <w:ilvl w:val="0"/>
-          <w:numId w:val="1"/>
-        </w:numPr>
-      </w:pPr>
-      <w:r>
-        <w:t>Sale – CancelledReceipt (cancel</w:t>
+        <w:t xml:space="preserve"> </w:t>
+      </w:r>
+      <w:proofErr w:type="spellStart"/>
+      <w:r>
+        <w:t>InventoryManager</w:t>
+      </w:r>
+      <w:proofErr w:type="spellEnd"/>
+      <w:r>
+        <w:t xml:space="preserve"> (prepares) </w:t>
+      </w:r>
+      <w:proofErr w:type="gramStart"/>
+      <w:r>
+        <w:t>0..</w:t>
+      </w:r>
+      <w:proofErr w:type="gramEnd"/>
+      <w:r>
+        <w:t>* to 1</w:t>
+      </w:r>
+    </w:p>
+    <w:p>
+      <w:pPr>
+        <w:pStyle w:val="ListParagraph"/>
+        <w:numPr>
+          <w:ilvl w:val="0"/>
+          <w:numId w:val="1"/>
+        </w:numPr>
+      </w:pPr>
+      <w:proofErr w:type="spellStart"/>
+      <w:r>
+        <w:t>SupplierOrder</w:t>
+      </w:r>
+      <w:proofErr w:type="spellEnd"/>
+      <w:r>
+        <w:t xml:space="preserve"> – </w:t>
+      </w:r>
+      <w:proofErr w:type="spellStart"/>
+      <w:r>
+        <w:t>StoreManager</w:t>
+      </w:r>
+      <w:proofErr w:type="spellEnd"/>
+      <w:r>
+        <w:t xml:space="preserve"> (verifies) </w:t>
+      </w:r>
+      <w:proofErr w:type="gramStart"/>
+      <w:r>
+        <w:t>0..</w:t>
+      </w:r>
+      <w:proofErr w:type="gramEnd"/>
+      <w:r>
+        <w:t xml:space="preserve">* to </w:t>
+      </w:r>
+      <w:proofErr w:type="gramStart"/>
+      <w:r>
+        <w:t>0..</w:t>
+      </w:r>
+      <w:proofErr w:type="gramEnd"/>
+      <w:r>
+        <w:t>1</w:t>
+      </w:r>
+    </w:p>
+    <w:p>
+      <w:pPr>
+        <w:pStyle w:val="ListParagraph"/>
+        <w:numPr>
+          <w:ilvl w:val="0"/>
+          <w:numId w:val="1"/>
+        </w:numPr>
+      </w:pPr>
+      <w:proofErr w:type="gramStart"/>
+      <w:r>
+        <w:t>Sale – Salesperson</w:t>
+      </w:r>
+      <w:proofErr w:type="gramEnd"/>
+      <w:r>
+        <w:t xml:space="preserve"> </w:t>
+      </w:r>
+      <w:r>
+        <w:t xml:space="preserve">(processes) </w:t>
+      </w:r>
+      <w:proofErr w:type="gramStart"/>
+      <w:r>
+        <w:t>0..</w:t>
+      </w:r>
+      <w:proofErr w:type="gramEnd"/>
+      <w:r>
+        <w:t>* to 1</w:t>
+      </w:r>
+    </w:p>
+    <w:p>
+      <w:pPr>
+        <w:pStyle w:val="ListParagraph"/>
+        <w:numPr>
+          <w:ilvl w:val="0"/>
+          <w:numId w:val="1"/>
+        </w:numPr>
+      </w:pPr>
+      <w:r>
+        <w:t xml:space="preserve">Sale – </w:t>
+      </w:r>
+      <w:proofErr w:type="spellStart"/>
+      <w:r>
+        <w:t>CancelledReceipt</w:t>
+      </w:r>
+      <w:proofErr w:type="spellEnd"/>
+      <w:r>
+        <w:t xml:space="preserve"> (cancel</w:t>
       </w:r>
       <w:r>
         <w:t>s)</w:t>
       </w:r>
       <w:r>
-        <w:t xml:space="preserve"> 1 to 0..1</w:t>
+        <w:t xml:space="preserve"> 1 to </w:t>
+      </w:r>
+      <w:proofErr w:type="gramStart"/>
+      <w:r>
+        <w:t>0..</w:t>
+      </w:r>
+      <w:proofErr w:type="gramEnd"/>
+      <w:r>
+        <w:t>1</w:t>
       </w:r>
     </w:p>
     <w:p>
@@ -1374,7 +1743,15 @@
         <w:t>)</w:t>
       </w:r>
       <w:r>
-        <w:t xml:space="preserve"> 1 to 0..*</w:t>
+        <w:t xml:space="preserve"> 1 to </w:t>
+      </w:r>
+      <w:proofErr w:type="gramStart"/>
+      <w:r>
+        <w:t>0..</w:t>
+      </w:r>
+      <w:proofErr w:type="gramEnd"/>
+      <w:r>
+        <w:t>*</w:t>
       </w:r>
     </w:p>
     <w:p>
@@ -1389,7 +1766,15 @@
         <w:t>Re</w:t>
       </w:r>
       <w:r>
-        <w:t>placement – Item (replaces) 0..* to 1</w:t>
+        <w:t xml:space="preserve">placement – Item (replaces) </w:t>
+      </w:r>
+      <w:proofErr w:type="gramStart"/>
+      <w:r>
+        <w:t>0..</w:t>
+      </w:r>
+      <w:proofErr w:type="gramEnd"/>
+      <w:r>
+        <w:t>* to 1</w:t>
       </w:r>
     </w:p>
     <w:p>
@@ -1415,8 +1800,13 @@
           <w:numId w:val="1"/>
         </w:numPr>
       </w:pPr>
-      <w:r>
-        <w:t xml:space="preserve">PearlMartSystem – Inventory </w:t>
+      <w:proofErr w:type="spellStart"/>
+      <w:r>
+        <w:t>PearlMartSystem</w:t>
+      </w:r>
+      <w:proofErr w:type="spellEnd"/>
+      <w:r>
+        <w:t xml:space="preserve"> – Inventory </w:t>
       </w:r>
       <w:r>
         <w:t>(1 to 1)</w:t>
@@ -1430,9 +1820,11 @@
           <w:numId w:val="1"/>
         </w:numPr>
       </w:pPr>
+      <w:proofErr w:type="spellStart"/>
       <w:r>
         <w:t>PearlMartSystem</w:t>
       </w:r>
+      <w:proofErr w:type="spellEnd"/>
       <w:r>
         <w:t xml:space="preserve"> – Employee, </w:t>
       </w:r>
@@ -1440,55 +1832,48 @@
         <w:t>Inventory</w:t>
       </w:r>
       <w:r>
-        <w:t>, CustomerRequest (1 to 0..*)</w:t>
-      </w:r>
-    </w:p>
-    <w:p>
-      <w:pPr>
-        <w:pStyle w:val="ListParagraph"/>
-        <w:numPr>
-          <w:ilvl w:val="0"/>
-          <w:numId w:val="1"/>
-        </w:numPr>
-      </w:pPr>
+        <w:t xml:space="preserve">, </w:t>
+      </w:r>
+      <w:proofErr w:type="spellStart"/>
+      <w:r>
+        <w:t>CustomerRequest</w:t>
+      </w:r>
+      <w:proofErr w:type="spellEnd"/>
+      <w:r>
+        <w:t xml:space="preserve"> (1 to </w:t>
+      </w:r>
+      <w:proofErr w:type="gramStart"/>
+      <w:r>
+        <w:t>0..</w:t>
+      </w:r>
+      <w:proofErr w:type="gramEnd"/>
+      <w:r>
+        <w:t>*)</w:t>
+      </w:r>
+    </w:p>
+    <w:p>
+      <w:pPr>
+        <w:pStyle w:val="ListParagraph"/>
+        <w:numPr>
+          <w:ilvl w:val="0"/>
+          <w:numId w:val="1"/>
+        </w:numPr>
+      </w:pPr>
+      <w:proofErr w:type="spellStart"/>
       <w:r>
         <w:t>PearlMartSystem</w:t>
       </w:r>
-      <w:r>
-        <w:t xml:space="preserve"> to SupplierGateway</w:t>
-      </w:r>
-    </w:p>
-    <w:p>
-      <w:pPr>
-        <w:rPr>
-          <w:b/>
-          <w:bCs/>
-          <w:sz w:val="28"/>
-          <w:szCs w:val="28"/>
-        </w:rPr>
-      </w:pPr>
-      <w:r>
-        <w:rPr>
-          <w:b/>
-          <w:bCs/>
-          <w:sz w:val="28"/>
-          <w:szCs w:val="28"/>
-        </w:rPr>
-        <w:t>Methods</w:t>
-      </w:r>
-    </w:p>
-    <w:p>
-      <w:pPr>
-        <w:pStyle w:val="ListParagraph"/>
-        <w:numPr>
-          <w:ilvl w:val="0"/>
-          <w:numId w:val="1"/>
-        </w:numPr>
-      </w:pPr>
-      <w:r>
-        <w:t>g</w:t>
-      </w:r>
-    </w:p>
+      <w:proofErr w:type="spellEnd"/>
+      <w:r>
+        <w:t xml:space="preserve"> to </w:t>
+      </w:r>
+      <w:proofErr w:type="spellStart"/>
+      <w:r>
+        <w:t>SupplierGateway</w:t>
+      </w:r>
+      <w:proofErr w:type="spellEnd"/>
+    </w:p>
+    <w:p/>
     <w:sectPr>
       <w:pgSz w:w="11906" w:h="16838"/>
       <w:pgMar w:top="1440" w:right="1440" w:bottom="1440" w:left="1440" w:header="720" w:footer="720" w:gutter="0"/>
@@ -2222,6 +2607,7 @@
   <w:style w:type="character" w:default="1" w:styleId="DefaultParagraphFont">
     <w:name w:val="Default Paragraph Font"/>
     <w:uiPriority w:val="1"/>
+    <w:semiHidden/>
     <w:unhideWhenUsed/>
   </w:style>
   <w:style w:type="table" w:default="1" w:styleId="TableNormal">

</xml_diff>